<commit_message>
Renombrar carpeta del prototipo a SALUNIC-Sistema-de-Salud-y-Bienestar
- git mv de nombre_proyecto_integrador_grupo#8 a SALUNIC-Sistema-de-Salud-y-Bienestar
- Actualizar README.md (arbol de estructura)
- Actualizar salunic-defensa.docx (3 referencias: titulo, carpeta, comando cd)
</commit_message>
<xml_diff>
--- a/salunic-defensa.docx
+++ b/salunic-defensa.docx
@@ -37,18 +37,15 @@
         </w:rPr>
         <w:t>Guia de Estudio para la Defensa</w:t>
         <w:br/>
-      </w:r>
-      <w:r>
         <w:t>Programacion Estructurada - I Corte Evolutivo - II Semestre 2026</w:t>
         <w:br/>
-      </w:r>
-      <w:r>
-        <w:t>Proyecto Integrador: nombre_proyecto_integrador_grupo#8</w:t>
+        <w:t>Proyecto Integrador: SALUNIC-Sistema-de-Salud-y-Bienestar</w:t>
         <w:br/>
-      </w:r>
-      <w:r>
         <w:t>Integrantes: Grupo de 5 estudiantes</w:t>
       </w:r>
+      <w:r/>
+      <w:r/>
+      <w:r/>
     </w:p>
     <w:p/>
     <w:p>
@@ -96,7 +93,7 @@
         <w:pStyle w:val="ListBullet"/>
       </w:pPr>
       <w:r>
-        <w:t>Tener una carpeta llamada nombre_proyecto_integrador_grupo#8</w:t>
+        <w:t>Tener una carpeta llamada SALUNIC-Sistema-de-Salud-y-Bienestar</w:t>
       </w:r>
     </w:p>
     <w:p>
@@ -1568,7 +1565,7 @@
           <w:b w:val="0"/>
           <w:sz w:val="20"/>
         </w:rPr>
-        <w:t>cd nombre_proyecto_integrador_grupo#8</w:t>
+        <w:t>cd SALUNIC-Sistema-de-Salud-y-Bienestar</w:t>
       </w:r>
     </w:p>
     <w:p>

</xml_diff>

<commit_message>
Mejorar menu: submenus por modulo con retorno al menu principal
- Nuevo menu principal con 4 modulos (Usuarios, Citas, Medicamentos, Almacen)
- Cada modulo abre su submenu con las 6 operaciones CRUD (1-6)
- Opcion 0 en cada submenu regresa al menu principal
- Actualizar salunic-defensa.docx con la nueva estructura de dos niveles
</commit_message>
<xml_diff>
--- a/salunic-defensa.docx
+++ b/salunic-defensa.docx
@@ -1420,7 +1420,7 @@
           <w:b w:val="0"/>
           <w:sz w:val="20"/>
         </w:rPr>
-        <w:t xml:space="preserve">        mostrar_menu()           # muestra las opciones</w:t>
+        <w:t xml:space="preserve">        mostrar_menu_principal()  # muestra los 4 modulos</w:t>
       </w:r>
     </w:p>
     <w:p>
@@ -1488,7 +1488,7 @@
         <w:rPr>
           <w:b/>
         </w:rPr>
-        <w:t>El menu tiene 24 opciones + la opcion 0 para salir, organizadas por entidad:</w:t>
+        <w:t>El menú ahora es de DOS NIVELES (menu principal + submenús):</w:t>
       </w:r>
     </w:p>
     <w:p>
@@ -1496,7 +1496,7 @@
         <w:pStyle w:val="ListBullet"/>
       </w:pPr>
       <w:r>
-        <w:t>Opciones 1-6: Usuarios (registrar, buscar, actualizar, eliminar, contar, listar)</w:t>
+        <w:t>MENU PRINCIPAL (4 modulos):</w:t>
       </w:r>
     </w:p>
     <w:p>
@@ -1504,7 +1504,7 @@
         <w:pStyle w:val="ListBullet"/>
       </w:pPr>
       <w:r>
-        <w:t>Opciones 7-12: Citas medicas</w:t>
+        <w:t xml:space="preserve">  1. Gestion de Usuarios      -&gt; submenu con 6 opciones CRUD</w:t>
       </w:r>
     </w:p>
     <w:p>
@@ -1512,7 +1512,7 @@
         <w:pStyle w:val="ListBullet"/>
       </w:pPr>
       <w:r>
-        <w:t>Opciones 13-18: Medicamentos</w:t>
+        <w:t xml:space="preserve">  2. Gestion de Citas Medicas -&gt; submenu con 6 opciones CRUD</w:t>
       </w:r>
     </w:p>
     <w:p>
@@ -1520,7 +1520,7 @@
         <w:pStyle w:val="ListBullet"/>
       </w:pPr>
       <w:r>
-        <w:t>Opciones 19-24: Almacen / inventario</w:t>
+        <w:t xml:space="preserve">  3. Gestion de Medicamentos  -&gt; submenu con 6 opciones CRUD</w:t>
       </w:r>
     </w:p>
     <w:p>
@@ -1528,7 +1528,63 @@
         <w:pStyle w:val="ListBullet"/>
       </w:pPr>
       <w:r>
-        <w:t>Opcion 0: Salir</w:t>
+        <w:t xml:space="preserve">  4. Gestion de Almacen / Inventario -&gt; submenu con 6 opciones CRUD</w:t>
+      </w:r>
+    </w:p>
+    <w:p>
+      <w:pPr>
+        <w:pStyle w:val="ListBullet"/>
+      </w:pPr>
+      <w:r>
+        <w:t/>
+      </w:r>
+    </w:p>
+    <w:p>
+      <w:pPr>
+        <w:pStyle w:val="ListBullet"/>
+      </w:pPr>
+      <w:r>
+        <w:t>CADA SUBMENU tiene las 6 operaciones CRUD y la opcion 0 para volver al menu principal:</w:t>
+      </w:r>
+    </w:p>
+    <w:p>
+      <w:pPr>
+        <w:pStyle w:val="ListBullet"/>
+      </w:pPr>
+      <w:r>
+        <w:t>  1. Registrar   2. Buscar   3. Actualizar</w:t>
+      </w:r>
+    </w:p>
+    <w:p>
+      <w:pPr>
+        <w:pStyle w:val="ListBullet"/>
+      </w:pPr>
+      <w:r>
+        <w:t>  4. Eliminar    5. Contar   6. Listar</w:t>
+      </w:r>
+    </w:p>
+    <w:p>
+      <w:pPr>
+        <w:pStyle w:val="ListBullet"/>
+      </w:pPr>
+      <w:r>
+        <w:t>  0. Volver al menu principal</w:t>
+      </w:r>
+    </w:p>
+    <w:p>
+      <w:pPr>
+        <w:pStyle w:val="ListBullet"/>
+      </w:pPr>
+      <w:r>
+        <w:t>Ejemplo: elegir 1 (Usuarios) abre el submenu de usuarios; se elige registrar, buscar, etc.</w:t>
+      </w:r>
+    </w:p>
+    <w:p>
+      <w:pPr>
+        <w:pStyle w:val="ListBullet"/>
+      </w:pPr>
+      <w:r>
+        <w:t>Con 0 se regresa al menu principal para elegir otro modulo o salir.</w:t>
       </w:r>
     </w:p>
     <w:p>

</xml_diff>

<commit_message>
Precargar usuarios y citas medicas de ejemplo
- datos.py: agregar usuarios_iniciales (3 pacientes + 2 medicos) y citas_iniciales (3)
- funciones.py: cargar_datos_iniciales() ahora carga usuarios, citas, medicamentos e inventario
- Actualizar salunic-defensa.docx con los nuevos datos de ejemplo
</commit_message>
<xml_diff>
--- a/salunic-defensa.docx
+++ b/salunic-defensa.docx
@@ -806,7 +806,7 @@
         <w:rPr>
           <w:b w:val="0"/>
         </w:rPr>
-        <w:t>Tambien estan los datos iniciales de medicamentos e inventario, basados en la Lista Basica de Medicamentos Esenciales del MINSA (los que se encuentran en hospitales como el Fernando Velez Paiz y el Hospital Bautista). Ejemplos: Paracetamol, Ibuprofeno, Amoxicilina, Omeprazol, Metformina, Losartan, etc.</w:t>
+        <w:t>Tambien estan los datos iniciales de ejemplo. Medicamentos e inventario se basan en la Lista Basica de Medicamentos Esenciales del MINSA (los que se encuentran en hospitales como el Fernando Velez Paiz y el Hospital Bautista): Paracetamol, Ibuprofeno, Amoxicilina, Omeprazol, Metformina, Losartan, etc. Ademas se cargan 5 usuarios de ejemplo (3 pacientes y 2 medicos: Carlos, Ana, Luis, Dr. Maria Gomez, Dr. Pedro Sanchez) y 3 citas medicas de ejemplo.</w:t>
       </w:r>
     </w:p>
     <w:p>
@@ -1400,7 +1400,7 @@
           <w:b w:val="0"/>
           <w:sz w:val="20"/>
         </w:rPr>
-        <w:t xml:space="preserve">    f.cargar_datos_iniciales()   # carga los medicamentos e inventario</w:t>
+        <w:t xml:space="preserve">    f.cargar_datos_iniciales()   # carga usuarios, citas, medicamentos e inventario de ejemplo</w:t>
       </w:r>
     </w:p>
     <w:p>

</xml_diff>